<commit_message>
Add Snakemake workflow engine with inpaint plugin and path sanitization
Introduces dwi_pipeline/workflow/ as the default pipeline engine (Snakemake
plugins for all six steps), LIT inpainting containers/scripts, DWI-select
configs, and updates subject.sh/submit.sh/array.sh to use placeholder paths
instead of local NFS home directories or personal email addresses.
</commit_message>
<xml_diff>
--- a/dwi_pipeline/pipeline_science.docx
+++ b/dwi_pipeline/pipeline_science.docx
@@ -239,6 +239,14 @@
       </w:pPr>
       <w:r>
         <w:t>Software stack summary</w:t>
+      </w:r>
+    </w:p>
+    <w:p>
+      <w:pPr>
+        <w:pStyle w:val="ListNumber"/>
+      </w:pPr>
+      <w:r>
+        <w:t>Focal lesions: contusion masks, inpainting, and the tissue model</w:t>
       </w:r>
     </w:p>
     <w:p>
@@ -1068,6 +1076,20 @@
       </w:r>
     </w:p>
     <w:p>
+      <w:r>
+        <w:t xml:space="preserve">Populating this volume requires knowing where the pathology is, which is what a traced lesion mask provides. See </w:t>
+      </w:r>
+      <w:r>
+        <w:rPr>
+          <w:b/>
+        </w:rPr>
+        <w:t>§15</w:t>
+      </w:r>
+      <w:r>
+        <w:t xml:space="preserve"> for the mask convention, how an unhandled contusion propagates through the surfaces, 5TT and connectome, and the trade-off inpainting makes.</w:t>
+      </w:r>
+    </w:p>
+    <w:p>
       <w:pPr>
         <w:pStyle w:val="Heading3"/>
       </w:pPr>
@@ -1201,7 +1223,7 @@
         <w:t>This distinction is operational, not academic, because it interacts with the recon tool.</w:t>
       </w:r>
       <w:r>
-        <w:t xml:space="preserve"> FastSurfer writes DKT labels into </w:t>
+        <w:t xml:space="preserve"> Plain FastSurfer writes DKT labels into </w:t>
       </w:r>
       <w:r>
         <w:rPr>
@@ -1210,7 +1232,7 @@
         <w:t>`aparc.DKTatlas+aseg.mapped.mgz`</w:t>
       </w:r>
       <w:r>
-        <w:t xml:space="preserve">, usually symlinked to </w:t>
+        <w:t xml:space="preserve">, symlinked to </w:t>
       </w:r>
       <w:r>
         <w:rPr>
@@ -1273,7 +1295,52 @@
         <w:t>aparc.DKTatlas+aseg.mgz</w:t>
       </w:r>
       <w:r>
-        <w:t xml:space="preserve"> (DKT).</w:t>
+        <w:t xml:space="preserve"> (DKT). FastSurfer can be made to do the same by adding its own </w:t>
+      </w:r>
+      <w:r>
+        <w:rPr>
+          <w:rFonts w:ascii="Courier New" w:hAnsi="Courier New"/>
+        </w:rPr>
+        <w:t>--fsaparc</w:t>
+      </w:r>
+      <w:r>
+        <w:t xml:space="preserve"> flag (this pipeline's </w:t>
+      </w:r>
+      <w:r>
+        <w:rPr>
+          <w:rFonts w:ascii="Courier New" w:hAnsi="Courier New"/>
+        </w:rPr>
+        <w:t>--fast-fs</w:t>
+      </w:r>
+      <w:r>
+        <w:t xml:space="preserve">, §15.6 below covers the mechanism and cost) — that flag makes FastSurfer run FreeSurfer's classic aparc pipeline in addition to its deep-learning DKT mapping, so </w:t>
+      </w:r>
+      <w:r>
+        <w:rPr>
+          <w:rFonts w:ascii="Courier New" w:hAnsi="Courier New"/>
+        </w:rPr>
+        <w:t>aparc+aseg.mgz</w:t>
+      </w:r>
+      <w:r>
+        <w:t xml:space="preserve"> </w:t>
+      </w:r>
+      <w:r>
+        <w:rPr>
+          <w:b/>
+        </w:rPr>
+        <w:t>stops being a DKT symlink and becomes a real DK volume</w:t>
+      </w:r>
+      <w:r>
+        <w:t xml:space="preserve">, while the DKT segmentation survives under </w:t>
+      </w:r>
+      <w:r>
+        <w:rPr>
+          <w:rFonts w:ascii="Courier New" w:hAnsi="Courier New"/>
+        </w:rPr>
+        <w:t>aparc.DKTatlas+aseg.mgz</w:t>
+      </w:r>
+      <w:r>
+        <w:t>, exactly matching the recon-all layout.</w:t>
       </w:r>
     </w:p>
     <w:p>
@@ -1281,10 +1348,10 @@
         <w:rPr>
           <w:b/>
         </w:rPr>
-        <w:t>DKT is therefore the only parcellation both tools can produce, and the pipeline standardises on it.</w:t>
-      </w:r>
-      <w:r>
-        <w:t xml:space="preserve"> Step 4 outputs a 78-node DKT connectome by default whichever tool ran, reading the DKT image appropriate to the tree:</w:t>
+        <w:t>DKT is therefore the parcellation every tree can produce, and the pipeline standardises on it.</w:t>
+      </w:r>
+      <w:r>
+        <w:t xml:space="preserve"> Step 4 outputs a 78-node DKT connectome by default whichever tool (and flags) ran, reading the DKT image appropriate to the tree:</w:t>
       </w:r>
     </w:p>
     <w:tbl>
@@ -1494,7 +1561,7 @@
           </w:tcPr>
           <w:p>
             <w:r>
-              <w:t>`recon-all`</w:t>
+              <w:t>`--fast-fs` (FastSurfer+`--fsaparc`)</w:t>
             </w:r>
           </w:p>
         </w:tc>
@@ -1504,7 +1571,7 @@
           </w:tcPr>
           <w:p>
             <w:r>
-              <w:t>`dk`</w:t>
+              <w:t>`dkt` (default)</w:t>
             </w:r>
           </w:p>
         </w:tc>
@@ -1514,7 +1581,7 @@
           </w:tcPr>
           <w:p>
             <w:r>
-              <w:t>`aparc+aseg.mgz`</w:t>
+              <w:t>`aparc.DKTatlas+aseg.mgz`</w:t>
             </w:r>
           </w:p>
         </w:tc>
@@ -1524,7 +1591,7 @@
           </w:tcPr>
           <w:p>
             <w:r>
-              <w:t>`fs_default.txt`</w:t>
+              <w:t>`fs_dkt.txt`</w:t>
             </w:r>
           </w:p>
         </w:tc>
@@ -1534,7 +1601,7 @@
           </w:tcPr>
           <w:p>
             <w:r>
-              <w:t>84×84</w:t>
+              <w:t>78×78</w:t>
             </w:r>
           </w:p>
         </w:tc>
@@ -1544,7 +1611,7 @@
           </w:tcPr>
           <w:p>
             <w:r>
-              <w:t>`dk_connectome.csv`</w:t>
+              <w:t>`dkt_connectome.csv`</w:t>
             </w:r>
           </w:p>
         </w:tc>
@@ -1556,7 +1623,131 @@
           </w:tcPr>
           <w:p>
             <w:r>
-              <w:t>`--fastsurfer`</w:t>
+              <w:t>`recon-all`</w:t>
+            </w:r>
+          </w:p>
+        </w:tc>
+        <w:tc>
+          <w:tcPr>
+            <w:tcW w:type="dxa" w:w="1440"/>
+          </w:tcPr>
+          <w:p>
+            <w:r>
+              <w:t>`dk`</w:t>
+            </w:r>
+          </w:p>
+        </w:tc>
+        <w:tc>
+          <w:tcPr>
+            <w:tcW w:type="dxa" w:w="1440"/>
+          </w:tcPr>
+          <w:p>
+            <w:r>
+              <w:t>`aparc+aseg.mgz`</w:t>
+            </w:r>
+          </w:p>
+        </w:tc>
+        <w:tc>
+          <w:tcPr>
+            <w:tcW w:type="dxa" w:w="1440"/>
+          </w:tcPr>
+          <w:p>
+            <w:r>
+              <w:t>`fs_default.txt`</w:t>
+            </w:r>
+          </w:p>
+        </w:tc>
+        <w:tc>
+          <w:tcPr>
+            <w:tcW w:type="dxa" w:w="1440"/>
+          </w:tcPr>
+          <w:p>
+            <w:r>
+              <w:t>84×84</w:t>
+            </w:r>
+          </w:p>
+        </w:tc>
+        <w:tc>
+          <w:tcPr>
+            <w:tcW w:type="dxa" w:w="1440"/>
+          </w:tcPr>
+          <w:p>
+            <w:r>
+              <w:t>`dk_connectome.csv`</w:t>
+            </w:r>
+          </w:p>
+        </w:tc>
+      </w:tr>
+      <w:tr>
+        <w:tc>
+          <w:tcPr>
+            <w:tcW w:type="dxa" w:w="1440"/>
+          </w:tcPr>
+          <w:p>
+            <w:r>
+              <w:t>`--fast-fs` (FastSurfer+`--fsaparc`)</w:t>
+            </w:r>
+          </w:p>
+        </w:tc>
+        <w:tc>
+          <w:tcPr>
+            <w:tcW w:type="dxa" w:w="1440"/>
+          </w:tcPr>
+          <w:p>
+            <w:r>
+              <w:t>`dk`</w:t>
+            </w:r>
+          </w:p>
+        </w:tc>
+        <w:tc>
+          <w:tcPr>
+            <w:tcW w:type="dxa" w:w="1440"/>
+          </w:tcPr>
+          <w:p>
+            <w:r>
+              <w:t>`aparc+aseg.mgz` (is DK)</w:t>
+            </w:r>
+          </w:p>
+        </w:tc>
+        <w:tc>
+          <w:tcPr>
+            <w:tcW w:type="dxa" w:w="1440"/>
+          </w:tcPr>
+          <w:p>
+            <w:r>
+              <w:t>`fs_default.txt`</w:t>
+            </w:r>
+          </w:p>
+        </w:tc>
+        <w:tc>
+          <w:tcPr>
+            <w:tcW w:type="dxa" w:w="1440"/>
+          </w:tcPr>
+          <w:p>
+            <w:r>
+              <w:t>84×84</w:t>
+            </w:r>
+          </w:p>
+        </w:tc>
+        <w:tc>
+          <w:tcPr>
+            <w:tcW w:type="dxa" w:w="1440"/>
+          </w:tcPr>
+          <w:p>
+            <w:r>
+              <w:t>`dk_connectome.csv`</w:t>
+            </w:r>
+          </w:p>
+        </w:tc>
+      </w:tr>
+      <w:tr>
+        <w:tc>
+          <w:tcPr>
+            <w:tcW w:type="dxa" w:w="1440"/>
+          </w:tcPr>
+          <w:p>
+            <w:r>
+              <w:t>`--fastsurfer` (no `--fsaparc`)</w:t>
             </w:r>
           </w:p>
         </w:tc>
@@ -1621,10 +1812,10 @@
         <w:rPr>
           <w:b/>
         </w:rPr>
-        <w:t>`--fastsurfer` changes how long Step 2 takes, not the node set</w:t>
-      </w:r>
-      <w:r>
-        <w:t xml:space="preserve">. A cohort in which some subjects ran </w:t>
+        <w:t>`--fastsurfer`/`--fast-fs` change how long Step 2 takes (and, for `--fast-fs`, whether a DK atlas exists), not the DKT node set</w:t>
+      </w:r>
+      <w:r>
+        <w:t xml:space="preserve">. A cohort mixing </w:t>
       </w:r>
       <w:r>
         <w:rPr>
@@ -1633,12 +1824,30 @@
         <w:t>recon-all</w:t>
       </w:r>
       <w:r>
-        <w:t xml:space="preserve"> and others FastSurfer still pools into one 78-node array, and no analysis has to branch on which tool a subject used. That is the reason for the default: had it followed the recon tool, a mixed cohort would produce a mixture of 84- and 78-node matrices that cannot be stacked.</w:t>
+        <w:t xml:space="preserve">, </w:t>
+      </w:r>
+      <w:r>
+        <w:rPr>
+          <w:rFonts w:ascii="Courier New" w:hAnsi="Courier New"/>
+        </w:rPr>
+        <w:t>--fastsurfer</w:t>
+      </w:r>
+      <w:r>
+        <w:t xml:space="preserve"> and </w:t>
+      </w:r>
+      <w:r>
+        <w:rPr>
+          <w:rFonts w:ascii="Courier New" w:hAnsi="Courier New"/>
+        </w:rPr>
+        <w:t>--fast-fs</w:t>
+      </w:r>
+      <w:r>
+        <w:t xml:space="preserve"> subjects still pools into one 78-node DKT array, and no analysis has to branch on which tool or flag a subject used. That is the reason for the default: had it followed the recon tool, a mixed cohort would produce a mixture of 84- and 78-node matrices that cannot be stacked.</w:t>
       </w:r>
     </w:p>
     <w:p>
       <w:r>
-        <w:t xml:space="preserve">The last row is the one combination to avoid: the DK table asks for labels a DKT image does not contain, leaving </w:t>
+        <w:t xml:space="preserve">The last row is the one combination to avoid: plain FastSurfer plus a DK request asks for labels a DKT image does not contain, leaving </w:t>
       </w:r>
       <w:r>
         <w:rPr>
@@ -1647,34 +1856,34 @@
         <w:t>6 structurally empty nodes</w:t>
       </w:r>
       <w:r>
-        <w:t xml:space="preserve"> (indices 1, 31, 32, 50, 80, 81). Step 4 warns when it happens. Set </w:t>
+        <w:t xml:space="preserve"> (indices 1, 31, 32, 50, 80, 81). Step 4 warns when it happens and points at </w:t>
       </w:r>
       <w:r>
         <w:rPr>
           <w:rFonts w:ascii="Courier New" w:hAnsi="Courier New"/>
         </w:rPr>
+        <w:t>--fast-fs</w:t>
+      </w:r>
+      <w:r>
+        <w:t xml:space="preserve"> as the fix. Set </w:t>
+      </w:r>
+      <w:r>
+        <w:rPr>
+          <w:rFonts w:ascii="Courier New" w:hAnsi="Courier New"/>
+        </w:rPr>
         <w:t>CONNECTOME_PARCELLATION=auto</w:t>
       </w:r>
       <w:r>
-        <w:t xml:space="preserve"> to follow the recon tool instead, or </w:t>
+        <w:t xml:space="preserve"> to follow the tree instead of forcing DK on a plain-FastSurfer subject, or rerun that subject's Step 2 with </w:t>
       </w:r>
       <w:r>
         <w:rPr>
           <w:rFonts w:ascii="Courier New" w:hAnsi="Courier New"/>
         </w:rPr>
-        <w:t>dk</w:t>
-      </w:r>
-      <w:r>
-        <w:t xml:space="preserve"> to force the 84-node atlas where </w:t>
-      </w:r>
-      <w:r>
-        <w:rPr>
-          <w:rFonts w:ascii="Courier New" w:hAnsi="Courier New"/>
-        </w:rPr>
-        <w:t>recon-all</w:t>
-      </w:r>
-      <w:r>
-        <w:t xml:space="preserve"> makes it genuinely available.</w:t>
+        <w:t>--fast-fs</w:t>
+      </w:r>
+      <w:r>
+        <w:t xml:space="preserve"> to get a genuine DK atlas.</w:t>
       </w:r>
     </w:p>
     <w:p>
@@ -3861,7 +4070,7 @@
           </w:tcPr>
           <w:p>
             <w:r>
-              <w:t>Custom handling</w:t>
+              <w:t>Custom handling (§15.4)</w:t>
             </w:r>
           </w:p>
         </w:tc>
@@ -7293,7 +7502,2073 @@
         <w:pStyle w:val="Heading2"/>
       </w:pPr>
       <w:r>
-        <w:t>15. Design choices and alternatives</w:t>
+        <w:t>15. Focal lesions: contusion masks, inpainting, and the tissue model</w:t>
+      </w:r>
+    </w:p>
+    <w:p>
+      <w:r>
+        <w:t>Every stage of this pipeline assumes voxel intensities are drawn from a healthy brain. A focal lesion breaks that assumption in one place and, because the stages are chained, the error does not stay there. This section covers what a lesion mask is, how the damage propagates through the tissue model, and what the mask can be used for.</w:t>
+      </w:r>
+    </w:p>
+    <w:p>
+      <w:pPr>
+        <w:pStyle w:val="Heading3"/>
+      </w:pPr>
+      <w:r>
+        <w:t>15.1 The mask as a data object</w:t>
+      </w:r>
+    </w:p>
+    <w:p>
+      <w:r>
+        <w:t>Manually traced contusion masks follow the BIDS ROI convention, alongside the T1w they were drawn on:</w:t>
+      </w:r>
+    </w:p>
+    <w:p>
+      <w:r>
+        <w:rPr>
+          <w:rFonts w:ascii="Courier New" w:hAnsi="Courier New"/>
+          <w:sz w:val="18"/>
+        </w:rPr>
+        <w:t>sub-&lt;ID&gt;/ses-&lt;SES&gt;/anat/sub-&lt;ID&gt;_ses-&lt;SES&gt;_acq-3D_T1w_label-lesion_roi.nii.gz</w:t>
+      </w:r>
+    </w:p>
+    <w:p>
+      <w:r>
+        <w:rPr>
+          <w:rFonts w:ascii="Courier New" w:hAnsi="Courier New"/>
+        </w:rPr>
+        <w:t>label-lesion</w:t>
+      </w:r>
+      <w:r>
+        <w:t xml:space="preserve"> names the ROI and the </w:t>
+      </w:r>
+      <w:r>
+        <w:rPr>
+          <w:rFonts w:ascii="Courier New" w:hAnsi="Courier New"/>
+        </w:rPr>
+        <w:t>_roi</w:t>
+      </w:r>
+      <w:r>
+        <w:t xml:space="preserve"> suffix marks it as a region of interest defined on that T1w. The masks are </w:t>
+      </w:r>
+      <w:r>
+        <w:rPr>
+          <w:b/>
+        </w:rPr>
+        <w:t>not binary</w:t>
+      </w:r>
+      <w:r>
+        <w:t xml:space="preserve"> — they encode two distinct tissue states:</w:t>
+      </w:r>
+    </w:p>
+    <w:tbl>
+      <w:tblPr>
+        <w:tblStyle w:val="TableGrid"/>
+        <w:tblW w:type="auto" w:w="0"/>
+        <w:tblLook w:firstColumn="1" w:firstRow="1" w:lastColumn="0" w:lastRow="0" w:noHBand="0" w:noVBand="1" w:val="04A0"/>
+      </w:tblPr>
+      <w:tblGrid>
+        <w:gridCol w:w="2880"/>
+        <w:gridCol w:w="2880"/>
+        <w:gridCol w:w="2880"/>
+      </w:tblGrid>
+      <w:tr>
+        <w:tc>
+          <w:tcPr>
+            <w:tcW w:type="dxa" w:w="2880"/>
+          </w:tcPr>
+          <w:p>
+            <w:r>
+              <w:t>Value</w:t>
+            </w:r>
+          </w:p>
+        </w:tc>
+        <w:tc>
+          <w:tcPr>
+            <w:tcW w:type="dxa" w:w="2880"/>
+          </w:tcPr>
+          <w:p>
+            <w:r>
+              <w:t>Tissue state</w:t>
+            </w:r>
+          </w:p>
+        </w:tc>
+        <w:tc>
+          <w:tcPr>
+            <w:tcW w:type="dxa" w:w="2880"/>
+          </w:tcPr>
+          <w:p>
+            <w:r>
+              <w:t>Biology</w:t>
+            </w:r>
+          </w:p>
+        </w:tc>
+      </w:tr>
+      <w:tr>
+        <w:tc>
+          <w:tcPr>
+            <w:tcW w:type="dxa" w:w="2880"/>
+          </w:tcPr>
+          <w:p>
+            <w:r>
+              <w:t>1</w:t>
+            </w:r>
+          </w:p>
+        </w:tc>
+        <w:tc>
+          <w:tcPr>
+            <w:tcW w:type="dxa" w:w="2880"/>
+          </w:tcPr>
+          <w:p>
+            <w:r>
+              <w:t>**Core**</w:t>
+            </w:r>
+          </w:p>
+        </w:tc>
+        <w:tc>
+          <w:tcPr>
+            <w:tcW w:type="dxa" w:w="2880"/>
+          </w:tcPr>
+          <w:p>
+            <w:r>
+              <w:t>Haemorrhage and necrosis; cytoarchitecture and axonal continuity destroyed. Not recoverable.</w:t>
+            </w:r>
+          </w:p>
+        </w:tc>
+      </w:tr>
+      <w:tr>
+        <w:tc>
+          <w:tcPr>
+            <w:tcW w:type="dxa" w:w="2880"/>
+          </w:tcPr>
+          <w:p>
+            <w:r>
+              <w:t>2</w:t>
+            </w:r>
+          </w:p>
+        </w:tc>
+        <w:tc>
+          <w:tcPr>
+            <w:tcW w:type="dxa" w:w="2880"/>
+          </w:tcPr>
+          <w:p>
+            <w:r>
+              <w:t>**Oedema**</w:t>
+            </w:r>
+          </w:p>
+        </w:tc>
+        <w:tc>
+          <w:tcPr>
+            <w:tcW w:type="dxa" w:w="2880"/>
+          </w:tcPr>
+          <w:p>
+            <w:r>
+              <w:t>Raised water content in tissue that may still be viable, and which frequently resolves over months.</w:t>
+            </w:r>
+          </w:p>
+        </w:tc>
+      </w:tr>
+    </w:tbl>
+    <w:p/>
+    <w:p>
+      <w:r>
+        <w:t>The distinction matters because the two states have different futures. Core is permanent tissue loss; oedema is a transient state of tissue that may recover. Any processing decision that treats them identically implicitly asserts they are the same object.</w:t>
+      </w:r>
+    </w:p>
+    <w:p>
+      <w:r>
+        <w:t xml:space="preserve">A usable mask must share the </w:t>
+      </w:r>
+      <w:r>
+        <w:rPr>
+          <w:b/>
+        </w:rPr>
+        <w:t>voxel grid and affine</w:t>
+      </w:r>
+      <w:r>
+        <w:t xml:space="preserve"> of the T1w it annotates, since every downstream consumer indexes it against that image without resampling.</w:t>
+      </w:r>
+    </w:p>
+    <w:p>
+      <w:pPr>
+        <w:pStyle w:val="Heading3"/>
+      </w:pPr>
+      <w:r>
+        <w:t>15.2 Why intensity-based segmentation fails on a lesion</w:t>
+      </w:r>
+    </w:p>
+    <w:p>
+      <w:r>
+        <w:t>FAST (§7), FreeSurfer and FastSurfer all model voxel intensity as a mixture over a small set of healthy tissue classes. A contusion belongs to none of them: haemorrhage, necrosis and oedema produce T1w intensities that fit neither the CSF, GM nor WM distribution. Three failures follow.</w:t>
+      </w:r>
+    </w:p>
+    <w:p>
+      <w:r>
+        <w:rPr>
+          <w:b/>
+        </w:rPr>
+        <w:t>Tissue misclassification.</w:t>
+      </w:r>
+      <w:r>
+        <w:t xml:space="preserve"> The classifier must assign every voxel to some class, so lesion voxels are forced into the nearest healthy one. Oedema often lands in GM or CSF, haemorrhage in WM. The result is confidently wrong rather than flagged.</w:t>
+      </w:r>
+    </w:p>
+    <w:p>
+      <w:r>
+        <w:rPr>
+          <w:b/>
+        </w:rPr>
+        <w:t>Surface displacement.</w:t>
+      </w:r>
+      <w:r>
+        <w:t xml:space="preserve"> </w:t>
+      </w:r>
+      <w:r>
+        <w:rPr>
+          <w:rFonts w:ascii="Courier New" w:hAnsi="Courier New"/>
+        </w:rPr>
+        <w:t>recon-all</w:t>
+      </w:r>
+      <w:r>
+        <w:t xml:space="preserve"> and </w:t>
+      </w:r>
+      <w:r>
+        <w:rPr>
+          <w:rFonts w:ascii="Courier New" w:hAnsi="Courier New"/>
+        </w:rPr>
+        <w:t>recon-surf</w:t>
+      </w:r>
+      <w:r>
+        <w:t xml:space="preserve"> place the white and pial surfaces by following intensity gradients. A contusion that destroys the WM/GM contrast removes the gradient the surface is tracking, so the surface either collapses into the lesion or excludes spared cortex. Because surface placement is a global optimisation over a smooth mesh, the distortion </w:t>
+      </w:r>
+      <w:r>
+        <w:rPr>
+          <w:b/>
+        </w:rPr>
+        <w:t>extends beyond the lesion boundary</w:t>
+      </w:r>
+      <w:r>
+        <w:t xml:space="preserve"> into neighbouring gyri.</w:t>
+      </w:r>
+    </w:p>
+    <w:p>
+      <w:r>
+        <w:rPr>
+          <w:b/>
+        </w:rPr>
+        <w:t>Upstream failure.</w:t>
+      </w:r>
+      <w:r>
+        <w:t xml:space="preserve"> Skull-stripping and intensity normalisation can fail outright on a large lesion, in which case the whole reconstruction is unusable rather than locally wrong.</w:t>
+      </w:r>
+    </w:p>
+    <w:p>
+      <w:r>
+        <w:rPr>
+          <w:b/>
+        </w:rPr>
+        <w:t>Measured on a representative case.</w:t>
+      </w:r>
+      <w:r>
+        <w:t xml:space="preserve"> In one multifocal contusion case from this cohort — 18.2 cm³ across nine foci, bilateral, all at frontal-polar, orbitofrontal or lateral-temporal surfaces — the T1w intensity statistics show why no classifier can place this tissue:</w:t>
+      </w:r>
+    </w:p>
+    <w:tbl>
+      <w:tblPr>
+        <w:tblStyle w:val="TableGrid"/>
+        <w:tblW w:type="auto" w:w="0"/>
+        <w:tblLook w:firstColumn="1" w:firstRow="1" w:lastColumn="0" w:lastRow="0" w:noHBand="0" w:noVBand="1" w:val="04A0"/>
+      </w:tblPr>
+      <w:tblGrid>
+        <w:gridCol w:w="2880"/>
+        <w:gridCol w:w="2880"/>
+        <w:gridCol w:w="2880"/>
+      </w:tblGrid>
+      <w:tr>
+        <w:tc>
+          <w:tcPr>
+            <w:tcW w:type="dxa" w:w="2880"/>
+          </w:tcPr>
+          <w:p>
+            <w:r>
+              <w:t>Tissue</w:t>
+            </w:r>
+          </w:p>
+        </w:tc>
+        <w:tc>
+          <w:tcPr>
+            <w:tcW w:type="dxa" w:w="2880"/>
+          </w:tcPr>
+          <w:p>
+            <w:r>
+              <w:t>mean ± sd</w:t>
+            </w:r>
+          </w:p>
+        </w:tc>
+        <w:tc>
+          <w:tcPr>
+            <w:tcW w:type="dxa" w:w="2880"/>
+          </w:tcPr>
+          <w:p>
+            <w:r>
+              <w:t>5th–95th percentile</w:t>
+            </w:r>
+          </w:p>
+        </w:tc>
+      </w:tr>
+      <w:tr>
+        <w:tc>
+          <w:tcPr>
+            <w:tcW w:type="dxa" w:w="2880"/>
+          </w:tcPr>
+          <w:p>
+            <w:r>
+              <w:t>Healthy white matter</w:t>
+            </w:r>
+          </w:p>
+        </w:tc>
+        <w:tc>
+          <w:tcPr>
+            <w:tcW w:type="dxa" w:w="2880"/>
+          </w:tcPr>
+          <w:p>
+            <w:r>
+              <w:t>312 ± 46</w:t>
+            </w:r>
+          </w:p>
+        </w:tc>
+        <w:tc>
+          <w:tcPr>
+            <w:tcW w:type="dxa" w:w="2880"/>
+          </w:tcPr>
+          <w:p>
+            <w:r>
+              <w:t>235–385</w:t>
+            </w:r>
+          </w:p>
+        </w:tc>
+      </w:tr>
+      <w:tr>
+        <w:tc>
+          <w:tcPr>
+            <w:tcW w:type="dxa" w:w="2880"/>
+          </w:tcPr>
+          <w:p>
+            <w:r>
+              <w:t>Healthy cortical GM</w:t>
+            </w:r>
+          </w:p>
+        </w:tc>
+        <w:tc>
+          <w:tcPr>
+            <w:tcW w:type="dxa" w:w="2880"/>
+          </w:tcPr>
+          <w:p>
+            <w:r>
+              <w:t>198 ± 42</w:t>
+            </w:r>
+          </w:p>
+        </w:tc>
+        <w:tc>
+          <w:tcPr>
+            <w:tcW w:type="dxa" w:w="2880"/>
+          </w:tcPr>
+          <w:p>
+            <w:r>
+              <w:t>132–270</w:t>
+            </w:r>
+          </w:p>
+        </w:tc>
+      </w:tr>
+      <w:tr>
+        <w:tc>
+          <w:tcPr>
+            <w:tcW w:type="dxa" w:w="2880"/>
+          </w:tcPr>
+          <w:p>
+            <w:r>
+              <w:t>Lesion **core**</w:t>
+            </w:r>
+          </w:p>
+        </w:tc>
+        <w:tc>
+          <w:tcPr>
+            <w:tcW w:type="dxa" w:w="2880"/>
+          </w:tcPr>
+          <w:p>
+            <w:r>
+              <w:t>213 ± **120**</w:t>
+            </w:r>
+          </w:p>
+        </w:tc>
+        <w:tc>
+          <w:tcPr>
+            <w:tcW w:type="dxa" w:w="2880"/>
+          </w:tcPr>
+          <w:p>
+            <w:r>
+              <w:t>55–445</w:t>
+            </w:r>
+          </w:p>
+        </w:tc>
+      </w:tr>
+      <w:tr>
+        <w:tc>
+          <w:tcPr>
+            <w:tcW w:type="dxa" w:w="2880"/>
+          </w:tcPr>
+          <w:p>
+            <w:r>
+              <w:t>Lesion **oedema**</w:t>
+            </w:r>
+          </w:p>
+        </w:tc>
+        <w:tc>
+          <w:tcPr>
+            <w:tcW w:type="dxa" w:w="2880"/>
+          </w:tcPr>
+          <w:p>
+            <w:r>
+              <w:t>260 ± 52</w:t>
+            </w:r>
+          </w:p>
+        </w:tc>
+        <w:tc>
+          <w:tcPr>
+            <w:tcW w:type="dxa" w:w="2880"/>
+          </w:tcPr>
+          <w:p>
+            <w:r>
+              <w:t>185–342</w:t>
+            </w:r>
+          </w:p>
+        </w:tc>
+      </w:tr>
+    </w:tbl>
+    <w:p/>
+    <w:p>
+      <w:r>
+        <w:t xml:space="preserve">The core's standard deviation is </w:t>
+      </w:r>
+      <w:r>
+        <w:rPr>
+          <w:b/>
+        </w:rPr>
+        <w:t>2.6× that of healthy tissue</w:t>
+      </w:r>
+      <w:r>
+        <w:t xml:space="preserve"> and its range spans both healthy classes and beyond: 53% of core voxels are darker than mean GM (necrosis, fluid) while 19% are brighter than mean WM (blood products). It is not a tissue class at all, and fitting one to it is meaningless. Oedema is tighter but lands in the valley </w:t>
+      </w:r>
+      <w:r>
+        <w:rPr>
+          <w:i/>
+        </w:rPr>
+        <w:t>between</w:t>
+      </w:r>
+      <w:r>
+        <w:t xml:space="preserve"> GM and WM, with </w:t>
+      </w:r>
+      <w:r>
+        <w:rPr>
+          <w:b/>
+        </w:rPr>
+        <w:t>75% of its voxels in the ambiguous band</w:t>
+      </w:r>
+      <w:r>
+        <w:t xml:space="preserve"> — a forced choice between two classes it fits equally badly.</w:t>
+      </w:r>
+    </w:p>
+    <w:p>
+      <w:pPr>
+        <w:pStyle w:val="Heading3"/>
+      </w:pPr>
+      <w:r>
+        <w:t>15.3 How the error propagates</w:t>
+      </w:r>
+    </w:p>
+    <w:p>
+      <w:r>
+        <w:t>The consequence for this pipeline specifically is that a lesion contaminates three products in sequence:</w:t>
+      </w:r>
+    </w:p>
+    <w:tbl>
+      <w:tblPr>
+        <w:tblStyle w:val="TableGrid"/>
+        <w:tblW w:type="auto" w:w="0"/>
+        <w:tblLook w:firstColumn="1" w:firstRow="1" w:lastColumn="0" w:lastRow="0" w:noHBand="0" w:noVBand="1" w:val="04A0"/>
+      </w:tblPr>
+      <w:tblGrid>
+        <w:gridCol w:w="2880"/>
+        <w:gridCol w:w="2880"/>
+        <w:gridCol w:w="2880"/>
+      </w:tblGrid>
+      <w:tr>
+        <w:tc>
+          <w:tcPr>
+            <w:tcW w:type="dxa" w:w="2880"/>
+          </w:tcPr>
+          <w:p>
+            <w:r>
+              <w:t>Stage</w:t>
+            </w:r>
+          </w:p>
+        </w:tc>
+        <w:tc>
+          <w:tcPr>
+            <w:tcW w:type="dxa" w:w="2880"/>
+          </w:tcPr>
+          <w:p>
+            <w:r>
+              <w:t>Mechanism</w:t>
+            </w:r>
+          </w:p>
+        </w:tc>
+        <w:tc>
+          <w:tcPr>
+            <w:tcW w:type="dxa" w:w="2880"/>
+          </w:tcPr>
+          <w:p>
+            <w:r>
+              <w:t>Result</w:t>
+            </w:r>
+          </w:p>
+        </w:tc>
+      </w:tr>
+      <w:tr>
+        <w:tc>
+          <w:tcPr>
+            <w:tcW w:type="dxa" w:w="2880"/>
+          </w:tcPr>
+          <w:p>
+            <w:r>
+              <w:t>**HSVS 5TT** (§8)</w:t>
+            </w:r>
+          </w:p>
+        </w:tc>
+        <w:tc>
+          <w:tcPr>
+            <w:tcW w:type="dxa" w:w="2880"/>
+          </w:tcPr>
+          <w:p>
+            <w:r>
+              <w:t>Built from FreeSurfer surfaces plus `aseg`</w:t>
+            </w:r>
+          </w:p>
+        </w:tc>
+        <w:tc>
+          <w:tcPr>
+            <w:tcW w:type="dxa" w:w="2880"/>
+          </w:tcPr>
+          <w:p>
+            <w:r>
+              <w:t>Displaced surfaces produce a 5TT whose tissue boundaries are wrong in and around the lesion</w:t>
+            </w:r>
+          </w:p>
+        </w:tc>
+      </w:tr>
+      <w:tr>
+        <w:tc>
+          <w:tcPr>
+            <w:tcW w:type="dxa" w:w="2880"/>
+          </w:tcPr>
+          <w:p>
+            <w:r>
+              <w:t>**ACT** (§9)</w:t>
+            </w:r>
+          </w:p>
+        </w:tc>
+        <w:tc>
+          <w:tcPr>
+            <w:tcW w:type="dxa" w:w="2880"/>
+          </w:tcPr>
+          <w:p>
+            <w:r>
+              <w:t>Applies propagation rules to that 5TT</w:t>
+            </w:r>
+          </w:p>
+        </w:tc>
+        <w:tc>
+          <w:tcPr>
+            <w:tcW w:type="dxa" w:w="2880"/>
+          </w:tcPr>
+          <w:p>
+            <w:r>
+              <w:t>Lesion labelled WM → streamlines propagate through destroyed tissue; labelled CSF → real streamlines discarded</w:t>
+            </w:r>
+          </w:p>
+        </w:tc>
+      </w:tr>
+      <w:tr>
+        <w:tc>
+          <w:tcPr>
+            <w:tcW w:type="dxa" w:w="2880"/>
+          </w:tcPr>
+          <w:p>
+            <w:r>
+              <w:t>**DKT connectome** (§2.6)</w:t>
+            </w:r>
+          </w:p>
+        </w:tc>
+        <w:tc>
+          <w:tcPr>
+            <w:tcW w:type="dxa" w:w="2880"/>
+          </w:tcPr>
+          <w:p>
+            <w:r>
+              <w:t>Nodes come from `aparc.DKTatlas+aseg.mgz`</w:t>
+            </w:r>
+          </w:p>
+        </w:tc>
+        <w:tc>
+          <w:tcPr>
+            <w:tcW w:type="dxa" w:w="2880"/>
+          </w:tcPr>
+          <w:p>
+            <w:r>
+              <w:t>Nodes overlapping the lesion have wrong geometry, so their rows and columns mix spared and destroyed tissue</w:t>
+            </w:r>
+          </w:p>
+        </w:tc>
+      </w:tr>
+    </w:tbl>
+    <w:p/>
+    <w:p>
+      <w:r>
+        <w:t xml:space="preserve">The errors are focal, but contusions are not uniformly distributed: they concentrate at the frontal poles, the orbitofrontal cortex and the anterior temporal lobes, where the brain contacts bone. In a TBI cohort the corrupted nodes are therefore </w:t>
+      </w:r>
+      <w:r>
+        <w:rPr>
+          <w:b/>
+        </w:rPr>
+        <w:t>the same nodes across subjects</w:t>
+      </w:r>
+      <w:r>
+        <w:t>, and they are usually the nodes of scientific interest. This is a systematic bias, not noise that averages out.</w:t>
+      </w:r>
+    </w:p>
+    <w:p>
+      <w:r>
+        <w:rPr>
+          <w:b/>
+        </w:rPr>
+        <w:t>Quantifying the labelling loss.</w:t>
+      </w:r>
+      <w:r>
+        <w:t xml:space="preserve"> Counting unlabelled voxels inside a lesion overstates the problem, because contusions sit at brain surfaces and superficial tissue is often unlabelled even in a healthy brain. The honest measurement reflects the mask across the midline — taken as the midpoint of the left and right cerebral white-matter centroids, not the scanner origin — and compares the lesion against its own healthy homologue. On the case above:</w:t>
+      </w:r>
+    </w:p>
+    <w:tbl>
+      <w:tblPr>
+        <w:tblStyle w:val="TableGrid"/>
+        <w:tblW w:type="auto" w:w="0"/>
+        <w:tblLook w:firstColumn="1" w:firstRow="1" w:lastColumn="0" w:lastRow="0" w:noHBand="0" w:noVBand="1" w:val="04A0"/>
+      </w:tblPr>
+      <w:tblGrid>
+        <w:gridCol w:w="2160"/>
+        <w:gridCol w:w="2160"/>
+        <w:gridCol w:w="2160"/>
+        <w:gridCol w:w="2160"/>
+      </w:tblGrid>
+      <w:tr>
+        <w:tc>
+          <w:tcPr>
+            <w:tcW w:type="dxa" w:w="2160"/>
+          </w:tcPr>
+          <w:p>
+            <w:r>
+              <w:t>Region</w:t>
+            </w:r>
+          </w:p>
+        </w:tc>
+        <w:tc>
+          <w:tcPr>
+            <w:tcW w:type="dxa" w:w="2160"/>
+          </w:tcPr>
+          <w:p>
+            <w:r>
+              <w:t>unlabelled</w:t>
+            </w:r>
+          </w:p>
+        </w:tc>
+        <w:tc>
+          <w:tcPr>
+            <w:tcW w:type="dxa" w:w="2160"/>
+          </w:tcPr>
+          <w:p>
+            <w:r>
+              <w:t>called WM</w:t>
+            </w:r>
+          </w:p>
+        </w:tc>
+        <w:tc>
+          <w:tcPr>
+            <w:tcW w:type="dxa" w:w="2160"/>
+          </w:tcPr>
+          <w:p>
+            <w:r>
+              <w:t>**called cortex**</w:t>
+            </w:r>
+          </w:p>
+        </w:tc>
+      </w:tr>
+      <w:tr>
+        <w:tc>
+          <w:tcPr>
+            <w:tcW w:type="dxa" w:w="2160"/>
+          </w:tcPr>
+          <w:p>
+            <w:r>
+              <w:t>Core — lesion side</w:t>
+            </w:r>
+          </w:p>
+        </w:tc>
+        <w:tc>
+          <w:tcPr>
+            <w:tcW w:type="dxa" w:w="2160"/>
+          </w:tcPr>
+          <w:p>
+            <w:r>
+              <w:t>76.5%</w:t>
+            </w:r>
+          </w:p>
+        </w:tc>
+        <w:tc>
+          <w:tcPr>
+            <w:tcW w:type="dxa" w:w="2160"/>
+          </w:tcPr>
+          <w:p>
+            <w:r>
+              <w:t>3.0%</w:t>
+            </w:r>
+          </w:p>
+        </w:tc>
+        <w:tc>
+          <w:tcPr>
+            <w:tcW w:type="dxa" w:w="2160"/>
+          </w:tcPr>
+          <w:p>
+            <w:r>
+              <w:t>**20.5%**</w:t>
+            </w:r>
+          </w:p>
+        </w:tc>
+      </w:tr>
+      <w:tr>
+        <w:tc>
+          <w:tcPr>
+            <w:tcW w:type="dxa" w:w="2160"/>
+          </w:tcPr>
+          <w:p>
+            <w:r>
+              <w:t>Core — healthy mirror</w:t>
+            </w:r>
+          </w:p>
+        </w:tc>
+        <w:tc>
+          <w:tcPr>
+            <w:tcW w:type="dxa" w:w="2160"/>
+          </w:tcPr>
+          <w:p>
+            <w:r>
+              <w:t>56.8%</w:t>
+            </w:r>
+          </w:p>
+        </w:tc>
+        <w:tc>
+          <w:tcPr>
+            <w:tcW w:type="dxa" w:w="2160"/>
+          </w:tcPr>
+          <w:p>
+            <w:r>
+              <w:t>6.0%</w:t>
+            </w:r>
+          </w:p>
+        </w:tc>
+        <w:tc>
+          <w:tcPr>
+            <w:tcW w:type="dxa" w:w="2160"/>
+          </w:tcPr>
+          <w:p>
+            <w:r>
+              <w:t>**37.3%**</w:t>
+            </w:r>
+          </w:p>
+        </w:tc>
+      </w:tr>
+      <w:tr>
+        <w:tc>
+          <w:tcPr>
+            <w:tcW w:type="dxa" w:w="2160"/>
+          </w:tcPr>
+          <w:p>
+            <w:r>
+              <w:t>Oedema — lesion side</w:t>
+            </w:r>
+          </w:p>
+        </w:tc>
+        <w:tc>
+          <w:tcPr>
+            <w:tcW w:type="dxa" w:w="2160"/>
+          </w:tcPr>
+          <w:p>
+            <w:r>
+              <w:t>10.3%</w:t>
+            </w:r>
+          </w:p>
+        </w:tc>
+        <w:tc>
+          <w:tcPr>
+            <w:tcW w:type="dxa" w:w="2160"/>
+          </w:tcPr>
+          <w:p>
+            <w:r>
+              <w:t>51.8%</w:t>
+            </w:r>
+          </w:p>
+        </w:tc>
+        <w:tc>
+          <w:tcPr>
+            <w:tcW w:type="dxa" w:w="2160"/>
+          </w:tcPr>
+          <w:p>
+            <w:r>
+              <w:t>**37.2%**</w:t>
+            </w:r>
+          </w:p>
+        </w:tc>
+      </w:tr>
+      <w:tr>
+        <w:tc>
+          <w:tcPr>
+            <w:tcW w:type="dxa" w:w="2160"/>
+          </w:tcPr>
+          <w:p>
+            <w:r>
+              <w:t>Oedema — healthy mirror</w:t>
+            </w:r>
+          </w:p>
+        </w:tc>
+        <w:tc>
+          <w:tcPr>
+            <w:tcW w:type="dxa" w:w="2160"/>
+          </w:tcPr>
+          <w:p>
+            <w:r>
+              <w:t>6.9%</w:t>
+            </w:r>
+          </w:p>
+        </w:tc>
+        <w:tc>
+          <w:tcPr>
+            <w:tcW w:type="dxa" w:w="2160"/>
+          </w:tcPr>
+          <w:p>
+            <w:r>
+              <w:t>48.9%</w:t>
+            </w:r>
+          </w:p>
+        </w:tc>
+        <w:tc>
+          <w:tcPr>
+            <w:tcW w:type="dxa" w:w="2160"/>
+          </w:tcPr>
+          <w:p>
+            <w:r>
+              <w:t>**44.1%**</w:t>
+            </w:r>
+          </w:p>
+        </w:tc>
+      </w:tr>
+    </w:tbl>
+    <w:p/>
+    <w:p>
+      <w:r>
+        <w:t xml:space="preserve">Inside the core, </w:t>
+      </w:r>
+      <w:r>
+        <w:rPr>
+          <w:rFonts w:ascii="Courier New" w:hAnsi="Courier New"/>
+        </w:rPr>
+        <w:t>recon-all</w:t>
+      </w:r>
+      <w:r>
+        <w:t xml:space="preserve"> assigns a cortical label to 20.5% of the tissue where the mirrored healthy region receives 37.3% — roughly </w:t>
+      </w:r>
+      <w:r>
+        <w:rPr>
+          <w:b/>
+        </w:rPr>
+        <w:t>45% of the cortical labelling is lost</w:t>
+      </w:r>
+      <w:r>
+        <w:t xml:space="preserve">. In the oedema the effect is milder and in the predicted direction: cortex falls from 44.1% to 37.2% with the difference absorbed into white matter, which is what oedema brightening cortex toward WM intensity should produce. The high absolute unlabelled fractions on </w:t>
+      </w:r>
+      <w:r>
+        <w:rPr>
+          <w:i/>
+        </w:rPr>
+        <w:t>both</w:t>
+      </w:r>
+      <w:r>
+        <w:t xml:space="preserve"> sides are the superficial location, not the injury; only the lesion-versus-mirror difference isolates the lesion effect.</w:t>
+      </w:r>
+    </w:p>
+    <w:p>
+      <w:pPr>
+        <w:pStyle w:val="Heading3"/>
+      </w:pPr>
+      <w:r>
+        <w:t>15.4 What the mask enables</w:t>
+      </w:r>
+    </w:p>
+    <w:p>
+      <w:r>
+        <w:t>The mask supports three distinct uses, which are independent and can be combined.</w:t>
+      </w:r>
+    </w:p>
+    <w:p>
+      <w:r>
+        <w:rPr>
+          <w:b/>
+        </w:rPr>
+        <w:t>Inpainting.</w:t>
+      </w:r>
+      <w:r>
+        <w:t xml:space="preserve"> The Lesion Inpainting Tool (LIT) paints healthy-looking tissue into the masked region so that segmentation and surface reconstruction run in-distribution. It treats </w:t>
+      </w:r>
+      <w:r>
+        <w:rPr>
+          <w:b/>
+        </w:rPr>
+        <w:t>any non-zero voxel as lesion</w:t>
+      </w:r>
+      <w:r>
+        <w:t xml:space="preserve">, so a core-plus-oedema mask is consumed whole and inpaints both; restricting to core requires thresholding the mask first. The documentation recommends </w:t>
+      </w:r>
+      <w:r>
+        <w:rPr>
+          <w:i/>
+        </w:rPr>
+        <w:t>generous</w:t>
+      </w:r>
+      <w:r>
+        <w:t xml:space="preserve"> annotation and potentially dilating the mask, on the explicit grounds that underestimating a lesion damages the segmentation more than overestimating it — </w:t>
+      </w:r>
+      <w:r>
+        <w:rPr>
+          <w:rFonts w:ascii="Courier New" w:hAnsi="Courier New"/>
+        </w:rPr>
+        <w:t>--dilate</w:t>
+      </w:r>
+      <w:r>
+        <w:t xml:space="preserve"> nonetheless defaults to </w:t>
+      </w:r>
+      <w:r>
+        <w:rPr>
+          <w:rFonts w:ascii="Courier New" w:hAnsi="Courier New"/>
+        </w:rPr>
+        <w:t>0</w:t>
+      </w:r>
+      <w:r>
+        <w:t xml:space="preserve">, and the published examples pass </w:t>
+      </w:r>
+      <w:r>
+        <w:rPr>
+          <w:rFonts w:ascii="Courier New" w:hAnsi="Courier New"/>
+        </w:rPr>
+        <w:t>--dilate 2</w:t>
+      </w:r>
+      <w:r>
+        <w:t>. The mask must match the T1w's voxel grid and vox2ras affine (§15.1).</w:t>
+      </w:r>
+    </w:p>
+    <w:p>
+      <w:r>
+        <w:t>Two properties make LIT usable as a pre-processing step rather than a commitment to one recon tool:</w:t>
+      </w:r>
+    </w:p>
+    <w:p>
+      <w:pPr>
+        <w:pStyle w:val="ListBullet"/>
+      </w:pPr>
+      <w:r>
+        <w:rPr>
+          <w:b/>
+        </w:rPr>
+        <w:t>It is available standalone.</w:t>
+      </w:r>
+      <w:r>
+        <w:t xml:space="preserve"> Beyond the FastSurfer extension, LIT ships as </w:t>
+      </w:r>
+      <w:r>
+        <w:rPr>
+          <w:rFonts w:ascii="Courier New" w:hAnsi="Courier New"/>
+        </w:rPr>
+        <w:t>neurolit</w:t>
+      </w:r>
+      <w:r>
+        <w:t xml:space="preserve"> — </w:t>
+      </w:r>
+      <w:r>
+        <w:rPr>
+          <w:rFonts w:ascii="Courier New" w:hAnsi="Courier New"/>
+        </w:rPr>
+        <w:t>pip install neurolit</w:t>
+      </w:r>
+      <w:r>
+        <w:t xml:space="preserve">, checkpoints (~700 MB) fetched once with </w:t>
+      </w:r>
+      <w:r>
+        <w:rPr>
+          <w:rFonts w:ascii="Courier New" w:hAnsi="Courier New"/>
+        </w:rPr>
+        <w:t>lit-download-models</w:t>
+      </w:r>
+      <w:r>
+        <w:t>, plus Docker and Singularity images (</w:t>
+      </w:r>
+      <w:r>
+        <w:rPr>
+          <w:rFonts w:ascii="Courier New" w:hAnsi="Courier New"/>
+        </w:rPr>
+        <w:t>deepmi/lit</w:t>
+      </w:r>
+      <w:r>
+        <w:t xml:space="preserve">). The interface is </w:t>
+      </w:r>
+      <w:r>
+        <w:rPr>
+          <w:rFonts w:ascii="Courier New" w:hAnsi="Courier New"/>
+        </w:rPr>
+        <w:t>lit-inpainting --input_image T1w.nii.gz --lesion_mask mask.nii.gz --output_directory DIR</w:t>
+      </w:r>
+      <w:r>
+        <w:t xml:space="preserve">, with </w:t>
+      </w:r>
+      <w:r>
+        <w:rPr>
+          <w:rFonts w:ascii="Courier New" w:hAnsi="Courier New"/>
+        </w:rPr>
+        <w:t>--dilate</w:t>
+      </w:r>
+      <w:r>
+        <w:t xml:space="preserve">, </w:t>
+      </w:r>
+      <w:r>
+        <w:rPr>
+          <w:rFonts w:ascii="Courier New" w:hAnsi="Courier New"/>
+        </w:rPr>
+        <w:t>--device</w:t>
+      </w:r>
+      <w:r>
+        <w:t xml:space="preserve"> and </w:t>
+      </w:r>
+      <w:r>
+        <w:rPr>
+          <w:rFonts w:ascii="Courier New" w:hAnsi="Courier New"/>
+        </w:rPr>
+        <w:t>--batch_size</w:t>
+      </w:r>
+      <w:r>
+        <w:t xml:space="preserve">. It is documented as supporting </w:t>
+      </w:r>
+      <w:r>
+        <w:rPr>
+          <w:b/>
+        </w:rPr>
+        <w:t>FreeSurfer as well as FastSurfer</w:t>
+      </w:r>
+      <w:r>
+        <w:t>, so the inpainted T1w can be fed to whichever recon tool Step 2 is configured for (§15.7).</w:t>
+      </w:r>
+    </w:p>
+    <w:p>
+      <w:pPr>
+        <w:pStyle w:val="ListBullet"/>
+      </w:pPr>
+      <w:r>
+        <w:rPr>
+          <w:b/>
+        </w:rPr>
+        <w:t>It leaves everything outside the mask untouched.</w:t>
+      </w:r>
+      <w:r>
+        <w:t xml:space="preserve"> The authors state this as a deliberate contrast with methods that resample or regenerate the whole volume: intensities outside the mask are unchanged and the image resolution is not altered. Inpainting therefore cannot perturb healthy-tissue measurements as a side effect — which matters here because the downstream products are surfaces, a 5TT and a parcellation (§15.3).</w:t>
+      </w:r>
+    </w:p>
+    <w:p>
+      <w:r>
+        <w:t xml:space="preserve">Architecturally, LIT is a resolution-independent DDPM built on latent diffusion models, with one set of the U-Net's fixed factor-2 up/downsampling replaced by </w:t>
+      </w:r>
+      <w:r>
+        <w:rPr>
+          <w:b/>
+        </w:rPr>
+        <w:t>VINN (Voxel-size Independent Neural Network) layers</w:t>
+      </w:r>
+      <w:r>
+        <w:t xml:space="preserve"> that adapt sampling to the input resolution and standardise feature-map size in latent space. This is why a 1.2 mm T1w needs no resampling to a training resolution. It operates in 2D rather than fully 3D — impractical beyond 256³ voxels — while still drawing on whole-brain context, notably the intact contralateral hemisphere.</w:t>
+      </w:r>
+    </w:p>
+    <w:p>
+      <w:r>
+        <w:t xml:space="preserve">Validation covered simulated tumours (N = 100), synthetic MS lesions (N = 39) and a heterogeneous set of real lesions and cavities assessed manually (N = 100); the most relevant result here is that it reproduced </w:t>
+      </w:r>
+      <w:r>
+        <w:rPr>
+          <w:b/>
+        </w:rPr>
+        <w:t>pre-operative cortical thickness estimates from post-operative resection scans</w:t>
+      </w:r>
+      <w:r>
+        <w:t xml:space="preserve">, which is a direct test of whether measurements in spared tissue survive the procedure. Note that the FastSurfer LIT extension is documented as </w:t>
+      </w:r>
+      <w:r>
+        <w:rPr>
+          <w:b/>
+        </w:rPr>
+        <w:t>experimental</w:t>
+      </w:r>
+      <w:r>
+        <w:t>, with a standing recommendation to review LIT-modified outputs before relying on them.</w:t>
+      </w:r>
+    </w:p>
+    <w:p>
+      <w:r>
+        <w:rPr>
+          <w:b/>
+        </w:rPr>
+        <w:t>The fifth 5TT volume.</w:t>
+      </w:r>
+      <w:r>
+        <w:t xml:space="preserve"> The 5TT format reserves volume 4 for pathological tissue (§2.5, §6) precisely so a lesion can be represented as itself rather than forced into a healthy class. How ACT then behaves at those voxels depends on configuration and should be verified against the MRtrix version in use before relying on it.</w:t>
+      </w:r>
+    </w:p>
+    <w:p>
+      <w:r>
+        <w:rPr>
+          <w:b/>
+        </w:rPr>
+        <w:t>Node-level quantification.</w:t>
+      </w:r>
+      <w:r>
+        <w:t xml:space="preserve"> Independently of how the lesion is segmented, the mask can be intersected with the DKT node image to record, per node, the fraction of its volume that is lesion core or oedema. That turns an invisible confound into an explicit per-node covariate, so affected nodes can be flagged, down-weighted or excluded at the group stage rather than silently contributing.</w:t>
+      </w:r>
+    </w:p>
+    <w:p>
+      <w:pPr>
+        <w:pStyle w:val="Heading3"/>
+      </w:pPr>
+      <w:r>
+        <w:t>15.5 The trade-off inpainting makes</w:t>
+      </w:r>
+    </w:p>
+    <w:p>
+      <w:r>
+        <w:t xml:space="preserve">Inpainting is a </w:t>
+      </w:r>
+      <w:r>
+        <w:rPr>
+          <w:b/>
+        </w:rPr>
+        <w:t>generative</w:t>
+      </w:r>
+      <w:r>
+        <w:t xml:space="preserve"> operation. The tissue it creates is plausible, not measured, and downstream stages cannot tell the difference. HSVS builds a 5TT over the synthetic tissue, and ACT then treats it as normal white and grey matter — so tractography is permitted to propagate streamlines through a region where axons have been destroyed. The bias runs </w:t>
+      </w:r>
+      <w:r>
+        <w:rPr>
+          <w:b/>
+        </w:rPr>
+        <w:t>upward, and it is largest where the injury is worst</w:t>
+      </w:r>
+      <w:r>
+        <w:t>, which is the opposite of the effect a TBI connectivity study is trying to measure.</w:t>
+      </w:r>
+    </w:p>
+    <w:p>
+      <w:r>
+        <w:t>Inpainting also does nothing to the diffusion data. The DWI signal inside the contusion is unchanged, so the result is a healthy-looking anatomical prior constraining tractography over genuinely abnormal diffusion. Inpainting resolves a segmentation failure by introducing a modelling assumption; it does not recover information the injury destroyed.</w:t>
+      </w:r>
+    </w:p>
+    <w:p>
+      <w:r>
+        <w:t xml:space="preserve">Two features of TBI specifically weaken the priors the model relies on, and both are visible in the case measured above. LIT draws on whole-brain context and the authors single out </w:t>
+      </w:r>
+      <w:r>
+        <w:rPr>
+          <w:b/>
+        </w:rPr>
+        <w:t>the intact contralateral hemisphere</w:t>
+      </w:r>
+      <w:r>
+        <w:t xml:space="preserve"> as a source of information about what a region should look like — but coup–contrecoup injury is frequently bilateral, so in that case the strongest available prior is itself abnormal at the homologous site. Separately, contusions sit at gyral crowns and sulcal surfaces, and diffusion-based anomaly work reports exactly that high-frequency cortical folding as the hardest case (§17, refs 12–13). Neither argues against inpainting; both argue that TBI contusions are a harder problem than the resection cavities LIT was validated on, and that outputs should be reviewed rather than assumed.</w:t>
+      </w:r>
+    </w:p>
+    <w:p>
+      <w:r>
+        <w:t xml:space="preserve">The counterargument is that </w:t>
+      </w:r>
+      <w:r>
+        <w:rPr>
+          <w:b/>
+        </w:rPr>
+        <w:t>not</w:t>
+      </w:r>
+      <w:r>
+        <w:t xml:space="preserve"> inpainting is not a neutral choice. On a large contusion, reconstruction without a mask yields displaced surfaces and misclassified tissue anyway. The decision is not between a clean result and a contaminated one, but between an error that is characterised and localised by an explicit mask and one that is uncontrolled and unrecorded. That is the reason to prefer inpainting </w:t>
+      </w:r>
+      <w:r>
+        <w:rPr>
+          <w:b/>
+        </w:rPr>
+        <w:t>combined with</w:t>
+      </w:r>
+      <w:r>
+        <w:t xml:space="preserve"> node-level quantification (§15.4): the first makes the reconstruction tractable, the second keeps the lesion visible in the provenance so it cannot be mistaken for healthy anatomy.</w:t>
+      </w:r>
+    </w:p>
+    <w:p>
+      <w:pPr>
+        <w:pStyle w:val="Heading3"/>
+      </w:pPr>
+      <w:r>
+        <w:t>15.6 Longitudinal consistency</w:t>
+      </w:r>
+    </w:p>
+    <w:p>
+      <w:r>
+        <w:t xml:space="preserve">In a multi-session design, lesion masks are frequently traced at the acute timepoint only. Inpainting a subject at one session and not at another means the two timepoints pass through </w:t>
+      </w:r>
+      <w:r>
+        <w:rPr>
+          <w:b/>
+        </w:rPr>
+        <w:t>different processing</w:t>
+      </w:r>
+      <w:r>
+        <w:t>, and any change measured in the affected nodes is then confounded by that difference rather than attributable to recovery. Oedema compounds this, since it resolves between acute and chronic imaging while core damage cavitates — so a mask traced acutely does not describe the later anatomy even after registration.</w:t>
+      </w:r>
+    </w:p>
+    <w:p>
+      <w:r>
+        <w:t xml:space="preserve">The requirement is consistency of </w:t>
+      </w:r>
+      <w:r>
+        <w:rPr>
+          <w:i/>
+        </w:rPr>
+        <w:t>processing</w:t>
+      </w:r>
+      <w:r>
+        <w:t>, not of anatomy: either every session of a subject is inpainted with a session-appropriate mask, or none is, with the affected nodes flagged instead.</w:t>
+      </w:r>
+    </w:p>
+    <w:p>
+      <w:pPr>
+        <w:pStyle w:val="Heading3"/>
+      </w:pPr>
+      <w:r>
+        <w:t>15.7 Status in this pipeline</w:t>
+      </w:r>
+    </w:p>
+    <w:p>
+      <w:r>
+        <w:t xml:space="preserve">Inpainting is </w:t>
+      </w:r>
+      <w:r>
+        <w:rPr>
+          <w:b/>
+        </w:rPr>
+        <w:t>implemented as Step 1.5</w:t>
+      </w:r>
+      <w:r>
+        <w:t xml:space="preserve">, opt-in via </w:t>
+      </w:r>
+      <w:r>
+        <w:rPr>
+          <w:rFonts w:ascii="Courier New" w:hAnsi="Courier New"/>
+        </w:rPr>
+        <w:t>--inpainting</w:t>
+      </w:r>
+      <w:r>
+        <w:t xml:space="preserve"> (</w:t>
+      </w:r>
+      <w:r>
+        <w:rPr>
+          <w:rFonts w:ascii="Courier New" w:hAnsi="Courier New"/>
+        </w:rPr>
+        <w:t>RUN_INPAINTING=1</w:t>
+      </w:r>
+      <w:r>
+        <w:t xml:space="preserve">), running </w:t>
+      </w:r>
+      <w:r>
+        <w:rPr>
+          <w:rFonts w:ascii="Courier New" w:hAnsi="Courier New"/>
+        </w:rPr>
+        <w:t>neurolit</w:t>
+      </w:r>
+      <w:r>
+        <w:t xml:space="preserve"> in </w:t>
+      </w:r>
+      <w:r>
+        <w:rPr>
+          <w:rFonts w:ascii="Courier New" w:hAnsi="Courier New"/>
+        </w:rPr>
+        <w:t>lit.sif</w:t>
+      </w:r>
+      <w:r>
+        <w:t xml:space="preserve"> between QSIPrep and recon. Because </w:t>
+      </w:r>
+      <w:r>
+        <w:rPr>
+          <w:rFonts w:ascii="Courier New" w:hAnsi="Courier New"/>
+        </w:rPr>
+        <w:t>neurolit</w:t>
+      </w:r>
+      <w:r>
+        <w:t xml:space="preserve"> runs standalone (§15.4), it sits </w:t>
+      </w:r>
+      <w:r>
+        <w:rPr>
+          <w:i/>
+        </w:rPr>
+        <w:t>before</w:t>
+      </w:r>
+      <w:r>
+        <w:t xml:space="preserve"> the recon dispatch rather than inside one recon branch, so the choice of recon tool stays orthogonal to whether a subject was inpainted:</w:t>
+      </w:r>
+    </w:p>
+    <w:p>
+      <w:r>
+        <w:rPr>
+          <w:rFonts w:ascii="Courier New" w:hAnsi="Courier New"/>
+          <w:sz w:val="18"/>
+        </w:rPr>
+        <w:t>resolve T1w  -&gt;  [if mask exists and RUN_INPAINTING=1: lit-inpainting -&gt; rebind T1w]  -&gt;  dispatch to recon tool</w:t>
+      </w:r>
+    </w:p>
+    <w:p>
+      <w:r>
+        <w:t xml:space="preserve">The properties that make this safe are that it is opt-in, a no-op when no mask exists (so it can be enabled cohort-wide across mixed TBI and control subjects), and non-destructive — the inpainted volume is written under </w:t>
+      </w:r>
+      <w:r>
+        <w:rPr>
+          <w:rFonts w:ascii="Courier New" w:hAnsi="Courier New"/>
+        </w:rPr>
+        <w:t>RESULTS_ROOT/inpainted/</w:t>
+      </w:r>
+      <w:r>
+        <w:t xml:space="preserve"> and BIDS is never modified. Container image, LIT version, mask path, selected labels, </w:t>
+      </w:r>
+      <w:r>
+        <w:rPr>
+          <w:rFonts w:ascii="Courier New" w:hAnsi="Courier New"/>
+        </w:rPr>
+        <w:t>--dilate</w:t>
+      </w:r>
+      <w:r>
+        <w:t xml:space="preserve"> and device are recorded in </w:t>
+      </w:r>
+      <w:r>
+        <w:rPr>
+          <w:rFonts w:ascii="Courier New" w:hAnsi="Courier New"/>
+        </w:rPr>
+        <w:t>inpainting.json</w:t>
+      </w:r>
+      <w:r>
+        <w:t xml:space="preserve"> next to the result, so an inpainted run is never indistinguishable from an ordinary one.</w:t>
+      </w:r>
+    </w:p>
+    <w:p>
+      <w:r>
+        <w:rPr>
+          <w:b/>
+        </w:rPr>
+        <w:t>Two properties are verified rather than assumed</w:t>
+      </w:r>
+      <w:r>
+        <w:t>, because both fail silently rather than loudly.</w:t>
+      </w:r>
+    </w:p>
+    <w:p>
+      <w:r>
+        <w:rPr>
+          <w:i/>
+        </w:rPr>
+        <w:t>Geometry.</w:t>
+      </w:r>
+      <w:r>
+        <w:t xml:space="preserve"> LIT conforms internally to 1 mm isotropic LIA and by default returns the result on that conformed grid. The T1w volumes in this cohort are 1.2 × 1 × 1 mm, so the conformed grid is not the acquisition grid. That matters because Step 4 warps the parcellation into </w:t>
+      </w:r>
+      <w:r>
+        <w:rPr>
+          <w:rFonts w:ascii="Courier New" w:hAnsi="Courier New"/>
+        </w:rPr>
+        <w:t>rawavg.mgz</w:t>
+      </w:r>
+      <w:r>
+        <w:t xml:space="preserve"> — the volume Step 2 consumed — and then affine-registers that volume onto QSIPrep's </w:t>
+      </w:r>
+      <w:r>
+        <w:rPr>
+          <w:rFonts w:ascii="Courier New" w:hAnsi="Courier New"/>
+        </w:rPr>
+        <w:t>desc-preproc_T1w</w:t>
+      </w:r>
+      <w:r>
+        <w:t xml:space="preserve"> (§7). Had the inpainted image come back on a different grid, the registration would still run and a connectome would still be written; it would simply be misaligned. The stage therefore passes </w:t>
+      </w:r>
+      <w:r>
+        <w:rPr>
+          <w:rFonts w:ascii="Courier New" w:hAnsi="Courier New"/>
+        </w:rPr>
+        <w:t>--keepgeom</w:t>
+      </w:r>
+      <w:r>
+        <w:t xml:space="preserve"> and then checks the returned shape and affine against the input, failing if they differ.</w:t>
+      </w:r>
+    </w:p>
+    <w:p>
+      <w:r>
+        <w:rPr>
+          <w:i/>
+        </w:rPr>
+        <w:t>Preservation outside the mask.</w:t>
+      </w:r>
+      <w:r>
+        <w:t xml:space="preserve"> LIT's guarantee is that only masked voxels are regenerated, but it rescales intensities globally and </w:t>
+      </w:r>
+      <w:r>
+        <w:rPr>
+          <w:rFonts w:ascii="Courier New" w:hAnsi="Courier New"/>
+        </w:rPr>
+        <w:t>--keepgeom</w:t>
+      </w:r>
+      <w:r>
+        <w:t xml:space="preserve"> resamples back to the native grid, so the voxels are not bit-identical and a naive difference is uninformative. What must survive is the ordering of intensities, measured as the correlation between original and inpainted over non-lesion tissue.</w:t>
+      </w:r>
+    </w:p>
+    <w:p>
+      <w:r>
+        <w:t xml:space="preserve">An absolute threshold on that correlation is the wrong test, and measuring it showed why. On these 1.2 mm anisotropic volumes the conform round-trip blurs the image before the model contributes anything: pushing the </w:t>
+      </w:r>
+      <w:r>
+        <w:rPr>
+          <w:i/>
+        </w:rPr>
+        <w:t>original</w:t>
+      </w:r>
+      <w:r>
+        <w:t xml:space="preserve"> through the same native → conformed → native journey with no inpainting at all scores </w:t>
+      </w:r>
+      <w:r>
+        <w:rPr>
+          <w:i/>
+        </w:rPr>
+        <w:t>r</w:t>
+      </w:r>
+      <w:r>
+        <w:t xml:space="preserve"> = 0.9943. The real inpainted volume scores </w:t>
+      </w:r>
+      <w:r>
+        <w:rPr>
+          <w:i/>
+        </w:rPr>
+        <w:t>r</w:t>
+      </w:r>
+      <w:r>
+        <w:t xml:space="preserve"> = 0.9912. So the model accounts for a drop of only 0.0031, and a naive threshold of 0.999 would reject every run on this cohort, including a perfect one.</w:t>
+      </w:r>
+    </w:p>
+    <w:p>
+      <w:r>
+        <w:t xml:space="preserve">The stage therefore computes that resampling control itself and fails when the inpainting falls more than </w:t>
+      </w:r>
+      <w:r>
+        <w:rPr>
+          <w:rFonts w:ascii="Courier New" w:hAnsi="Courier New"/>
+        </w:rPr>
+        <w:t>INPAINT_MAX_CORR_DROP</w:t>
+      </w:r>
+      <w:r>
+        <w:t xml:space="preserve"> (default 0.02) below it. Two independent runs of the same subject agreed on the drop to six decimal places while differing inside the lesion, which is the expected signature: the residual outside the mask is deterministic interpolation, and only the regenerated tissue reflects the stochastic sampling. This is the check that would catch inpainting perturbing the healthy hemisphere — the outcome that would invalidate every measurement the procedure exists to protect.</w:t>
+      </w:r>
+    </w:p>
+    <w:p>
+      <w:r>
+        <w:t xml:space="preserve">The round-trip blur is a real, if small, cost, and it is paid only by inpainted subjects. Within a cohort where some participants are inpainted and others are not, that is the same processing-consistency concern as §15.6 in a different guise, and it argues for reporting inpainting status as a covariate rather than assuming the two groups are exchangeable. </w:t>
+      </w:r>
+      <w:r>
+        <w:rPr>
+          <w:rFonts w:ascii="Courier New" w:hAnsi="Courier New"/>
+        </w:rPr>
+        <w:t>INPAINT_KEEPGEOM=0</w:t>
+      </w:r>
+      <w:r>
+        <w:t xml:space="preserve"> avoids the extra resample by handing recon the conformed volume directly, at the cost of the mask, the QC overlays and Step 4 no longer sharing one space.</w:t>
+      </w:r>
+    </w:p>
+    <w:p>
+      <w:r>
+        <w:t>Step 4 consumes the inpainted volume as its registration source whenever one exists, keeping the invariant that the image the parcellation was computed from is the image it is registered with. Because the stage is resolved by checking for the output file rather than by reading the flag, a later recon-only or connectome-only rerun still picks up an earlier inpainting instead of quietly reverting to the lesioned T1w.</w:t>
+      </w:r>
+    </w:p>
+    <w:p>
+      <w:r>
+        <w:t xml:space="preserve">Rerunning is </w:t>
+      </w:r>
+      <w:r>
+        <w:rPr>
+          <w:b/>
+        </w:rPr>
+        <w:t>not</w:t>
+      </w:r>
+      <w:r>
+        <w:t xml:space="preserve"> the default: diffusion sampling is unseeded, so a second run draws a different brain into the lesion bed than the one Step 2 already consumed. </w:t>
+      </w:r>
+      <w:r>
+        <w:rPr>
+          <w:rFonts w:ascii="Courier New" w:hAnsi="Courier New"/>
+        </w:rPr>
+        <w:t>INPAINT_SKIP_IF_EXISTS=1</w:t>
+      </w:r>
+      <w:r>
+        <w:t xml:space="preserve"> reuses the existing volume, which is the reproducible choice, and inverts the strict-rerun policy Step 2 applies to its own outputs (§15.7 differs from </w:t>
+      </w:r>
+      <w:r>
+        <w:rPr>
+          <w:rFonts w:ascii="Courier New" w:hAnsi="Courier New"/>
+        </w:rPr>
+        <w:t>RECON_SKIP_IF_EXISTS</w:t>
+      </w:r>
+      <w:r>
+        <w:t xml:space="preserve"> deliberately).</w:t>
+      </w:r>
+    </w:p>
+    <w:p>
+      <w:r>
+        <w:t xml:space="preserve">The remaining piece is the complementary Step 4 change described in §15.4: intersect the mask with the node image and record per-node lesion fraction. It is still outstanding, is independent of inpainting, and is worth having </w:t>
+      </w:r>
+      <w:r>
+        <w:rPr>
+          <w:b/>
+        </w:rPr>
+        <w:t>even if inpainting is never enabled</w:t>
+      </w:r>
+      <w:r>
+        <w:t>, since it is what makes the confound visible. It also motivates keeping the two-label mask intact: LIT reads any non-zero voxel as lesion and so needs no binarization, and the copy handed to it is separate from the original, which retains core and oedema as distinct labels for exactly this reporting.</w:t>
+      </w:r>
+    </w:p>
+    <w:p>
+      <w:pPr>
+        <w:pStyle w:val="Heading3"/>
+      </w:pPr>
+      <w:r>
+        <w:t>15.8 Lesion-aware reporting, and a constraint on the recon tool</w:t>
+      </w:r>
+    </w:p>
+    <w:p>
+      <w:r>
+        <w:t>Inpainting makes a reconstruction tractable; it does not make the inpainted region a valid measurement. Tissue inside the mask is synthetic, so any statistic computed over it is a statement about the generative model rather than the subject. Reporting has to exclude those regions explicitly, which is a separate step from inpainting.</w:t>
+      </w:r>
+    </w:p>
+    <w:p>
+      <w:r>
+        <w:rPr>
+          <w:rFonts w:ascii="Courier New" w:hAnsi="Courier New"/>
+        </w:rPr>
+        <w:t>neurolit</w:t>
+      </w:r>
+      <w:r>
+        <w:t xml:space="preserve"> ships this as </w:t>
+      </w:r>
+      <w:r>
+        <w:rPr>
+          <w:rFonts w:ascii="Courier New" w:hAnsi="Courier New"/>
+        </w:rPr>
+        <w:t>lit-postprocessing</w:t>
+      </w:r>
+      <w:r>
+        <w:t xml:space="preserve">, which maps the lesion into the segmentation files, runs </w:t>
+      </w:r>
+      <w:r>
+        <w:rPr>
+          <w:rFonts w:ascii="Courier New" w:hAnsi="Courier New"/>
+        </w:rPr>
+        <w:t>segstats</w:t>
+      </w:r>
+      <w:r>
+        <w:t xml:space="preserve">, and performs surface masking; </w:t>
+      </w:r>
+      <w:r>
+        <w:rPr>
+          <w:rFonts w:ascii="Courier New" w:hAnsi="Courier New"/>
+        </w:rPr>
+        <w:t>lesion_to_segmentation.py</w:t>
+      </w:r>
+      <w:r>
+        <w:t xml:space="preserve"> inserts lesion labels into volumetric segmentations and </w:t>
+      </w:r>
+      <w:r>
+        <w:rPr>
+          <w:rFonts w:ascii="Courier New" w:hAnsi="Courier New"/>
+        </w:rPr>
+        <w:t>lesion_to_surface.py</w:t>
+      </w:r>
+      <w:r>
+        <w:t xml:space="preserve"> projects the mask onto the cortical surfaces. The documented order is to obtain lesion surface labels, extract regional statistics, project to a common surface template, mask the lesion vertices, and only then run group statistics. Because that operates on </w:t>
+      </w:r>
+      <w:r>
+        <w:rPr>
+          <w:rFonts w:ascii="Courier New" w:hAnsi="Courier New"/>
+        </w:rPr>
+        <w:t>fsaverage</w:t>
+      </w:r>
+      <w:r>
+        <w:t>-space vertex data, it composes with surface-based consortium protocols without modification.</w:t>
+      </w:r>
+    </w:p>
+    <w:p>
+      <w:r>
+        <w:rPr>
+          <w:b/>
+        </w:rPr>
+        <w:t>A constraint worth recording before switching recon tools.</w:t>
+      </w:r>
+      <w:r>
+        <w:t xml:space="preserve"> Surface-based consortium reporting conventionally reads the Desikan–Killiany </w:t>
+      </w:r>
+      <w:r>
+        <w:rPr>
+          <w:rFonts w:ascii="Courier New" w:hAnsi="Courier New"/>
+        </w:rPr>
+        <w:t>?h.aparc.stats</w:t>
+      </w:r>
+      <w:r>
+        <w:t xml:space="preserve"> (68 regions). These files are produced by </w:t>
+      </w:r>
+      <w:r>
+        <w:rPr>
+          <w:rFonts w:ascii="Courier New" w:hAnsi="Courier New"/>
+        </w:rPr>
+        <w:t>recon-all</w:t>
+      </w:r>
+      <w:r>
+        <w:t xml:space="preserve"> and by plain FastSurfer are </w:t>
+      </w:r>
+      <w:r>
+        <w:rPr>
+          <w:b/>
+        </w:rPr>
+        <w:t>not</w:t>
+      </w:r>
+      <w:r>
+        <w:t xml:space="preserve"> — its stats and annotations are DKT-only, unless FastSurfer is also given its own </w:t>
+      </w:r>
+      <w:r>
+        <w:rPr>
+          <w:rFonts w:ascii="Courier New" w:hAnsi="Courier New"/>
+        </w:rPr>
+        <w:t>--fsaparc</w:t>
+      </w:r>
+      <w:r>
+        <w:t xml:space="preserve"> flag. Verified on trees produced by this pipeline:</w:t>
+      </w:r>
+    </w:p>
+    <w:tbl>
+      <w:tblPr>
+        <w:tblStyle w:val="TableGrid"/>
+        <w:tblW w:type="auto" w:w="0"/>
+        <w:tblLook w:firstColumn="1" w:firstRow="1" w:lastColumn="0" w:lastRow="0" w:noHBand="0" w:noVBand="1" w:val="04A0"/>
+      </w:tblPr>
+      <w:tblGrid>
+        <w:gridCol w:w="2160"/>
+        <w:gridCol w:w="2160"/>
+        <w:gridCol w:w="2160"/>
+        <w:gridCol w:w="2160"/>
+      </w:tblGrid>
+      <w:tr>
+        <w:tc>
+          <w:tcPr>
+            <w:tcW w:type="dxa" w:w="2160"/>
+          </w:tcPr>
+          <w:p>
+            <w:r>
+              <w:t>File</w:t>
+            </w:r>
+          </w:p>
+        </w:tc>
+        <w:tc>
+          <w:tcPr>
+            <w:tcW w:type="dxa" w:w="2160"/>
+          </w:tcPr>
+          <w:p>
+            <w:r>
+              <w:t>`recon-all` tree</w:t>
+            </w:r>
+          </w:p>
+        </w:tc>
+        <w:tc>
+          <w:tcPr>
+            <w:tcW w:type="dxa" w:w="2160"/>
+          </w:tcPr>
+          <w:p>
+            <w:r>
+              <w:t>FastSurfer tree (`--fastsurfer`)</w:t>
+            </w:r>
+          </w:p>
+        </w:tc>
+        <w:tc>
+          <w:tcPr>
+            <w:tcW w:type="dxa" w:w="2160"/>
+          </w:tcPr>
+          <w:p>
+            <w:r>
+              <w:t>FastSurfer tree (`--fast-fs`)</w:t>
+            </w:r>
+          </w:p>
+        </w:tc>
+      </w:tr>
+      <w:tr>
+        <w:tc>
+          <w:tcPr>
+            <w:tcW w:type="dxa" w:w="2160"/>
+          </w:tcPr>
+          <w:p>
+            <w:r>
+              <w:t>`lh/rh.aparc.stats` (DK)</w:t>
+            </w:r>
+          </w:p>
+        </w:tc>
+        <w:tc>
+          <w:tcPr>
+            <w:tcW w:type="dxa" w:w="2160"/>
+          </w:tcPr>
+          <w:p>
+            <w:r>
+              <w:t>present</w:t>
+            </w:r>
+          </w:p>
+        </w:tc>
+        <w:tc>
+          <w:tcPr>
+            <w:tcW w:type="dxa" w:w="2160"/>
+          </w:tcPr>
+          <w:p>
+            <w:r>
+              <w:t>**absent**</w:t>
+            </w:r>
+          </w:p>
+        </w:tc>
+        <w:tc>
+          <w:tcPr>
+            <w:tcW w:type="dxa" w:w="2160"/>
+          </w:tcPr>
+          <w:p>
+            <w:r>
+              <w:t>present</w:t>
+            </w:r>
+          </w:p>
+        </w:tc>
+      </w:tr>
+      <w:tr>
+        <w:tc>
+          <w:tcPr>
+            <w:tcW w:type="dxa" w:w="2160"/>
+          </w:tcPr>
+          <w:p>
+            <w:r>
+              <w:t>`lh/rh.aparc.annot` (DK)</w:t>
+            </w:r>
+          </w:p>
+        </w:tc>
+        <w:tc>
+          <w:tcPr>
+            <w:tcW w:type="dxa" w:w="2160"/>
+          </w:tcPr>
+          <w:p>
+            <w:r>
+              <w:t>present</w:t>
+            </w:r>
+          </w:p>
+        </w:tc>
+        <w:tc>
+          <w:tcPr>
+            <w:tcW w:type="dxa" w:w="2160"/>
+          </w:tcPr>
+          <w:p>
+            <w:r>
+              <w:t>**absent**</w:t>
+            </w:r>
+          </w:p>
+        </w:tc>
+        <w:tc>
+          <w:tcPr>
+            <w:tcW w:type="dxa" w:w="2160"/>
+          </w:tcPr>
+          <w:p>
+            <w:r>
+              <w:t>present</w:t>
+            </w:r>
+          </w:p>
+        </w:tc>
+      </w:tr>
+      <w:tr>
+        <w:tc>
+          <w:tcPr>
+            <w:tcW w:type="dxa" w:w="2160"/>
+          </w:tcPr>
+          <w:p>
+            <w:r>
+              <w:t>`aparc+aseg.mgz`</w:t>
+            </w:r>
+          </w:p>
+        </w:tc>
+        <w:tc>
+          <w:tcPr>
+            <w:tcW w:type="dxa" w:w="2160"/>
+          </w:tcPr>
+          <w:p>
+            <w:r>
+              <w:t>DK volume</w:t>
+            </w:r>
+          </w:p>
+        </w:tc>
+        <w:tc>
+          <w:tcPr>
+            <w:tcW w:type="dxa" w:w="2160"/>
+          </w:tcPr>
+          <w:p>
+            <w:r>
+              <w:t>DKT volume (symlink)</w:t>
+            </w:r>
+          </w:p>
+        </w:tc>
+        <w:tc>
+          <w:tcPr>
+            <w:tcW w:type="dxa" w:w="2160"/>
+          </w:tcPr>
+          <w:p>
+            <w:r>
+              <w:t>**DK volume** (no longer a DKT symlink)</w:t>
+            </w:r>
+          </w:p>
+        </w:tc>
+      </w:tr>
+      <w:tr>
+        <w:tc>
+          <w:tcPr>
+            <w:tcW w:type="dxa" w:w="2160"/>
+          </w:tcPr>
+          <w:p>
+            <w:r>
+              <w:t>`aparc.DKTatlas+aseg.mgz`</w:t>
+            </w:r>
+          </w:p>
+        </w:tc>
+        <w:tc>
+          <w:tcPr>
+            <w:tcW w:type="dxa" w:w="2160"/>
+          </w:tcPr>
+          <w:p>
+            <w:r>
+              <w:t>present</w:t>
+            </w:r>
+          </w:p>
+        </w:tc>
+        <w:tc>
+          <w:tcPr>
+            <w:tcW w:type="dxa" w:w="2160"/>
+          </w:tcPr>
+          <w:p>
+            <w:r>
+              <w:t>present</w:t>
+            </w:r>
+          </w:p>
+        </w:tc>
+        <w:tc>
+          <w:tcPr>
+            <w:tcW w:type="dxa" w:w="2160"/>
+          </w:tcPr>
+          <w:p>
+            <w:r>
+              <w:t>present (DKT is not lost)</w:t>
+            </w:r>
+          </w:p>
+        </w:tc>
+      </w:tr>
+      <w:tr>
+        <w:tc>
+          <w:tcPr>
+            <w:tcW w:type="dxa" w:w="2160"/>
+          </w:tcPr>
+          <w:p>
+            <w:r>
+              <w:t>`lh/rh.aparc.DKTatlas.stats`</w:t>
+            </w:r>
+          </w:p>
+        </w:tc>
+        <w:tc>
+          <w:tcPr>
+            <w:tcW w:type="dxa" w:w="2160"/>
+          </w:tcPr>
+          <w:p>
+            <w:r>
+              <w:t>present</w:t>
+            </w:r>
+          </w:p>
+        </w:tc>
+        <w:tc>
+          <w:tcPr>
+            <w:tcW w:type="dxa" w:w="2160"/>
+          </w:tcPr>
+          <w:p>
+            <w:r>
+              <w:t>present as `.mapped.stats`</w:t>
+            </w:r>
+          </w:p>
+        </w:tc>
+        <w:tc>
+          <w:tcPr>
+            <w:tcW w:type="dxa" w:w="2160"/>
+          </w:tcPr>
+          <w:p>
+            <w:r>
+              <w:t>present as `.mapped.stats`</w:t>
+            </w:r>
+          </w:p>
+        </w:tc>
+      </w:tr>
+      <w:tr>
+        <w:tc>
+          <w:tcPr>
+            <w:tcW w:type="dxa" w:w="2160"/>
+          </w:tcPr>
+          <w:p>
+            <w:r>
+              <w:t>`lh/rh.aparc.DKTatlas.annot`</w:t>
+            </w:r>
+          </w:p>
+        </w:tc>
+        <w:tc>
+          <w:tcPr>
+            <w:tcW w:type="dxa" w:w="2160"/>
+          </w:tcPr>
+          <w:p>
+            <w:r>
+              <w:t>present</w:t>
+            </w:r>
+          </w:p>
+        </w:tc>
+        <w:tc>
+          <w:tcPr>
+            <w:tcW w:type="dxa" w:w="2160"/>
+          </w:tcPr>
+          <w:p>
+            <w:r>
+              <w:t>present</w:t>
+            </w:r>
+          </w:p>
+        </w:tc>
+        <w:tc>
+          <w:tcPr>
+            <w:tcW w:type="dxa" w:w="2160"/>
+          </w:tcPr>
+          <w:p>
+            <w:r>
+              <w:t>present</w:t>
+            </w:r>
+          </w:p>
+        </w:tc>
+      </w:tr>
+    </w:tbl>
+    <w:p/>
+    <w:p>
+      <w:r>
+        <w:t xml:space="preserve">So adopting </w:t>
+      </w:r>
+      <w:r>
+        <w:rPr>
+          <w:i/>
+        </w:rPr>
+        <w:t>plain</w:t>
+      </w:r>
+      <w:r>
+        <w:t xml:space="preserve"> FastSurfer in order to obtain LIT would remove exactly the DK files a consortium protocol expects. There are two ways to avoid that, and this pipeline supports both: </w:t>
+      </w:r>
+      <w:r>
+        <w:rPr>
+          <w:rFonts w:ascii="Courier New" w:hAnsi="Courier New"/>
+        </w:rPr>
+        <w:t>neurolit</w:t>
+      </w:r>
+      <w:r>
+        <w:t xml:space="preserve"> runs standalone against FreeSurfer (§15.4), so inpainting as a pre-Step-2 stage (§15.7) keeps DK available via </w:t>
+      </w:r>
+      <w:r>
+        <w:rPr>
+          <w:rFonts w:ascii="Courier New" w:hAnsi="Courier New"/>
+        </w:rPr>
+        <w:t>recon-all</w:t>
+      </w:r>
+      <w:r>
+        <w:t xml:space="preserve"> without changing recon tool at all; or, if FastSurfer's runtime is preferred, </w:t>
+      </w:r>
+      <w:r>
+        <w:rPr>
+          <w:rFonts w:ascii="Courier New" w:hAnsi="Courier New"/>
+        </w:rPr>
+        <w:t>--fast-fs</w:t>
+      </w:r>
+      <w:r>
+        <w:t xml:space="preserve"> (FastSurfer + </w:t>
+      </w:r>
+      <w:r>
+        <w:rPr>
+          <w:rFonts w:ascii="Courier New" w:hAnsi="Courier New"/>
+        </w:rPr>
+        <w:t>--fsaparc</w:t>
+      </w:r>
+      <w:r>
+        <w:t xml:space="preserve">) reproduces the recon-all row above on a FastSurfer tree, at the cost of FastSurfer's own recon-surf module also running FreeSurfer's classic surface-parcellation code instead of just mapping its deep-learning labels — call it a few tens of minutes to roughly an hour of extra CPU time, not separately benchmarked on this cluster, small next to </w:t>
+      </w:r>
+      <w:r>
+        <w:rPr>
+          <w:rFonts w:ascii="Courier New" w:hAnsi="Courier New"/>
+        </w:rPr>
+        <w:t>recon-all</w:t>
+      </w:r>
+      <w:r>
+        <w:t xml:space="preserve">'s 6–10 h but non-trivial next to plain FastSurfer's 1–2 h. Either way, DKT for the connectome (§2.6) is unaffected: Step 4 reads </w:t>
+      </w:r>
+      <w:r>
+        <w:rPr>
+          <w:rFonts w:ascii="Courier New" w:hAnsi="Courier New"/>
+        </w:rPr>
+        <w:t>aparc.DKTatlas+aseg.mgz</w:t>
+      </w:r>
+      <w:r>
+        <w:t xml:space="preserve"> explicitly for a DKT request on any tree whose </w:t>
+      </w:r>
+      <w:r>
+        <w:rPr>
+          <w:rFonts w:ascii="Courier New" w:hAnsi="Courier New"/>
+        </w:rPr>
+        <w:t>aparc+aseg.mgz</w:t>
+      </w:r>
+      <w:r>
+        <w:t xml:space="preserve"> is DK-based, so the connectome node set never depends on this choice.</w:t>
+      </w:r>
+    </w:p>
+    <w:p/>
+    <w:p>
+      <w:pPr>
+        <w:pStyle w:val="Heading2"/>
+      </w:pPr>
+      <w:r>
+        <w:t>16. Design choices and alternatives</w:t>
       </w:r>
     </w:p>
     <w:tbl>
@@ -7526,6 +9801,50 @@
           </w:p>
         </w:tc>
       </w:tr>
+      <w:tr>
+        <w:tc>
+          <w:tcPr>
+            <w:tcW w:type="dxa" w:w="4320"/>
+          </w:tcPr>
+          <w:p>
+            <w:r>
+              <w:t>**Lesion masks not yet consumed**</w:t>
+            </w:r>
+          </w:p>
+        </w:tc>
+        <w:tc>
+          <w:tcPr>
+            <w:tcW w:type="dxa" w:w="4320"/>
+          </w:tcPr>
+          <w:p>
+            <w:r>
+              <w:t>Traced contusion masks exist but Step 2 does not inpaint and Step 4 measures no node overlap, so lesion-adjacent nodes are currently uncontrolled rather than characterised (§15.7)</w:t>
+            </w:r>
+          </w:p>
+        </w:tc>
+      </w:tr>
+      <w:tr>
+        <w:tc>
+          <w:tcPr>
+            <w:tcW w:type="dxa" w:w="4320"/>
+          </w:tcPr>
+          <w:p>
+            <w:r>
+              <w:t>**Inpainting as pre-Step-2, if enabled**</w:t>
+            </w:r>
+          </w:p>
+        </w:tc>
+        <w:tc>
+          <w:tcPr>
+            <w:tcW w:type="dxa" w:w="4320"/>
+          </w:tcPr>
+          <w:p>
+            <w:r>
+              <w:t>`neurolit` runs standalone against FreeSurfer, so rebinding the T1w before recon dispatch serves both recon tools and preserves DK stats for surface reporting; a `--lesion_mask` flag inside the FastSurfer branch would force a tool switch that costs `?h.aparc.stats` (§15.7, §15.8)</w:t>
+            </w:r>
+          </w:p>
+        </w:tc>
+      </w:tr>
     </w:tbl>
     <w:p/>
     <w:p>
@@ -7563,7 +9882,7 @@
         <w:pStyle w:val="Heading2"/>
       </w:pPr>
       <w:r>
-        <w:t>16. References</w:t>
+        <w:t>17. References</w:t>
       </w:r>
     </w:p>
     <w:p>
@@ -7801,13 +10120,158 @@
         <w:t xml:space="preserve"> — fast deep-learning cortical segmentation and surface reconstruction.</w:t>
       </w:r>
     </w:p>
+    <w:p>
+      <w:pPr>
+        <w:pStyle w:val="ListNumber"/>
+      </w:pPr>
+      <w:r>
+        <w:t xml:space="preserve">Pollak C, Kuegler D, Bauer T, Rueber T, Reuter M. </w:t>
+      </w:r>
+      <w:r>
+        <w:rPr>
+          <w:b/>
+        </w:rPr>
+        <w:t>FastSurfer-LIT: Lesion Inpainting Tool for Whole Brain MRI Segmentation with Tumors, Cavities and Abnormalities.</w:t>
+      </w:r>
+      <w:r>
+        <w:t xml:space="preserve"> </w:t>
+      </w:r>
+      <w:r>
+        <w:rPr>
+          <w:i/>
+        </w:rPr>
+        <w:t>Imaging Neuroscience</w:t>
+      </w:r>
+      <w:r>
+        <w:t xml:space="preserve"> 2025. doi:10.1162/imag_a_00446 (</w:t>
+      </w:r>
+      <w:r>
+        <w:rPr>
+          <w:b/>
+        </w:rPr>
+        <w:t>LIT</w:t>
+      </w:r>
+      <w:r>
+        <w:t>, §15)</w:t>
+      </w:r>
+    </w:p>
+    <w:p>
+      <w:pPr>
+        <w:pStyle w:val="ListNumber"/>
+      </w:pPr>
+      <w:r>
+        <w:t xml:space="preserve">FastSurfer </w:t>
+      </w:r>
+      <w:r>
+        <w:rPr>
+          <w:b/>
+        </w:rPr>
+        <w:t>Lesion Inpainting Tool (LIT)</w:t>
+      </w:r>
+      <w:r>
+        <w:t xml:space="preserve"> module documentation — mask requirements, non-zero-voxel convention, generous-annotation guidance, and experimental status.</w:t>
+      </w:r>
+    </w:p>
+    <w:p>
+      <w:pPr>
+        <w:pStyle w:val="ListNumber"/>
+      </w:pPr>
+      <w:r>
+        <w:rPr>
+          <w:b/>
+        </w:rPr>
+        <w:t>neuroLIT documentation</w:t>
+      </w:r>
+      <w:r>
+        <w:t xml:space="preserve"> — standalone </w:t>
+      </w:r>
+      <w:r>
+        <w:rPr>
+          <w:rFonts w:ascii="Courier New" w:hAnsi="Courier New"/>
+        </w:rPr>
+        <w:t>lit-inpainting</w:t>
+      </w:r>
+      <w:r>
+        <w:t xml:space="preserve"> / </w:t>
+      </w:r>
+      <w:r>
+        <w:rPr>
+          <w:rFonts w:ascii="Courier New" w:hAnsi="Courier New"/>
+        </w:rPr>
+        <w:t>lit-postprocessing</w:t>
+      </w:r>
+      <w:r>
+        <w:t xml:space="preserve"> usage, PyPI and container distribution, and the lesion-exclusion workflow for surface-based analysis (§15.4, §15.8).</w:t>
+      </w:r>
+    </w:p>
+    <w:p>
+      <w:pPr>
+        <w:pStyle w:val="ListNumber"/>
+      </w:pPr>
+      <w:r>
+        <w:t xml:space="preserve">Wyatt J, Leach A, Schmon SM, Willcocks CG. </w:t>
+      </w:r>
+      <w:r>
+        <w:rPr>
+          <w:b/>
+        </w:rPr>
+        <w:t>AnoDDPM: Anomaly detection with denoising diffusion probabilistic models using simplex noise.</w:t>
+      </w:r>
+      <w:r>
+        <w:t xml:space="preserve"> </w:t>
+      </w:r>
+      <w:r>
+        <w:rPr>
+          <w:i/>
+        </w:rPr>
+        <w:t>CVPRW</w:t>
+      </w:r>
+      <w:r>
+        <w:t xml:space="preserve"> 2022. (Partial diffusion and pseudo-healthy reconstruction; reports degraded performance around gyri and sulci — §15.5)</w:t>
+      </w:r>
+    </w:p>
+    <w:p>
+      <w:pPr>
+        <w:pStyle w:val="ListNumber"/>
+      </w:pPr>
+      <w:r>
+        <w:t xml:space="preserve">Bercea CI, Neumayr M, Rueckert D, Schnabel JA. </w:t>
+      </w:r>
+      <w:r>
+        <w:rPr>
+          <w:b/>
+        </w:rPr>
+        <w:t>Mask, Stitch, and Re-Sample: Enhancing robustness and generalizability in anomaly detection through automatic diffusion models.</w:t>
+      </w:r>
+      <w:r>
+        <w:t xml:space="preserve"> </w:t>
+      </w:r>
+      <w:r>
+        <w:rPr>
+          <w:i/>
+        </w:rPr>
+        <w:t>ICML Workshop on Interpretable ML in Healthcare</w:t>
+      </w:r>
+      <w:r>
+        <w:t xml:space="preserve"> 2023. (</w:t>
+      </w:r>
+      <w:r>
+        <w:rPr>
+          <w:b/>
+        </w:rPr>
+        <w:t>AutoDDPM</w:t>
+      </w:r>
+      <w:r>
+        <w:t>; the noise paradox and automatic mask generation — §15.5)</w:t>
+      </w:r>
+    </w:p>
     <w:p/>
     <w:p>
       <w:r>
         <w:rPr>
           <w:i/>
         </w:rPr>
-        <w:t>Document version: 2026-06-11 — aligned with `subject.sh` on branch `lab-pipeline` and QSIRecon spec `mrtrix_singleshell_ss3t_ACT-hsvs`.</w:t>
+        <w:t>Document version: 2026-07-31 — aligned with `subject.sh` and QSIRecon spec `mrtrix_singleshell_ss3t_ACT-hsvs`. §15.7 rewritten: inpainting is now implemented as Step 1.5 (`--inpainting`, `lit.sif`), including the `--keepgeom` requirement for this cohort's 1.2 mm anisotropic T1w and the two post-run checks that guard geometry and healthy tissue. Earlier revision (2026-07-28): standalone `neurolit` route and DDPM/VINN specifics (§15.4), measured intensity and mirror-controlled labelling evidence (§15.2–15.3), and lesion-aware reporting with the DK/FastSurfer stats constraint (§15.8).</w:t>
       </w:r>
     </w:p>
     <w:sectPr>

</xml_diff>